<commit_message>
L12: Word-Mastercheckliste und aktualisierte Regressionstests
</commit_message>
<xml_diff>
--- a/bauhaus.docx
+++ b/bauhaus.docx
@@ -28,7 +28,7 @@
         <w:jc w:val="center"/>
       </w:pPr>
       <w:r>
-        <w:t>Stand: 27. Oktober 2026   •   Basis: Mein Alltag V0.0.2   •   Aktuelle App-Version: V0.11.0 (L11)</w:t>
+        <w:t>Stand: 27. Oktober 2026   •   Basis: Mein Alltag V0.0.2   •   Aktuelle App-Version: V0.12.0 (L12)</w:t>
       </w:r>
     </w:p>
     <w:p>
@@ -90,7 +90,7 @@
     <w:p>
       <w:pPr/>
       <w:r>
-        <w:t>Abgeschlossen (Code und GitHub): 11 / 36 Updates   |   Offen: 25 / 36 Updates. L11 auf GitHub main in V0.11.0 veröffentlicht (Commit f11d7c29). Chrome-/Android-Praxistest weiterhin offen.</w:t>
+        <w:t>Abgeschlossen (Code und GitHub): 12 / 36 Updates   |   Offen: 24 / 36 Updates. L12 auf GitHub main als V0.12.0 veröffentlicht (Code-Commit ef13c460). Chrome-/Android-Praxistest weiterhin offen.</w:t>
       </w:r>
     </w:p>
     <w:p>
@@ -774,19 +774,19 @@
         <w:sdtPr>
           <w:alias w:val="Update abgeschlossen"/>
           <w14:checkbox>
-            <w14:checked w14:val="0"/>
+            <w14:checked w14:val="1"/>
             <w14:checkedState w14:val="2612" w14:font="MS Gothic"/>
             <w14:uncheckedState w14:val="2610" w14:font="MS Gothic"/>
           </w14:checkbox>
         </w:sdtPr>
         <w:sdtContent>
           <w:r>
-            <w:t>☐</w:t>
+            <w:t>☑</w:t>
           </w:r>
         </w:sdtContent>
       </w:sdt>
       <w:r>
-        <w:t xml:space="preserve">  L12  ·  Kategorien &amp; intelligente Organisation</w:t>
+        <w:t xml:space="preserve">  L12  ·  Größeres 3D-Regal &amp; echte Packungsbestände</w:t>
       </w:r>
     </w:p>
     <w:p>
@@ -797,10 +797,9 @@
         <w:rPr>
           <w:b/>
         </w:rPr>
-        <w:t xml:space="preserve">Umfang: </w:t>
-      </w:r>
-      <w:r>
-        <w:t>Freie Kategorien/Unterkategorien, Farben, Symbole, Tags, Vorlagen, Sammelzuordnung.</w:t>
+      </w:r>
+      <w:r>
+        <w:t>Umfang: Größere 3D-Raumansicht, Vollbild und Zoom; sichtbare symbolische Artikelpackungen auf belegten Regalen; Regal antippen zeigt Fachbestände, Fotos und angebrochene Packungen; nicht eingeräumte Artikel zuordnen; Packungsrestmengen korrekt erfassen.</w:t>
       </w:r>
     </w:p>
     <w:p>
@@ -811,10 +810,14 @@
         <w:rPr>
           <w:b/>
         </w:rPr>
-        <w:t xml:space="preserve">Abnahme: </w:t>
-      </w:r>
-      <w:r>
-        <w:t>Kategorie unabhängig vom Lagerort; keine verwaisten Artikel beim Umbenennen.</w:t>
+      </w:r>
+      <w:r>
+        <w:t>Abnahme: Reale Artikel erscheinen am richtigen Möbel/Fach und im Regal-Inventar; echte Mengen ohne Doppelzählung; freie Artikel des Raums sind erkennbar; Packung 100 Stk mit 37 Stk Rest zeigt nur 37 Stk realen Anfangsbestand.</w:t>
+      </w:r>
+    </w:p>
+    <w:p>
+      <w:r>
+        <w:t xml:space="preserve">  L13  ·  Kategorien, Suche, Filter &amp; Favoriten</w:t>
       </w:r>
     </w:p>
     <w:p>
@@ -838,7 +841,7 @@
         </w:sdtContent>
       </w:sdt>
       <w:r>
-        <w:t xml:space="preserve">  L13  ·  Suchen, Filter &amp; Favoriten</w:t>
+        <w:t>Umfang: Hierher verschoben aus dem ursprünglich geplanten L12: freie Kategorien/Unterkategorien, Symbole, Farben, Tags, Vorlagen und Sammelzuordnung. Außerdem Artikelsuche, Schreibvarianten, Sortierung und Favoriten.</w:t>
       </w:r>
     </w:p>
     <w:p>
@@ -849,10 +852,9 @@
         <w:rPr>
           <w:b/>
         </w:rPr>
-        <w:t xml:space="preserve">Umfang: </w:t>
-      </w:r>
-      <w:r>
-        <w:t>Artikelname, Hersteller, Nummer, Schreibvarianten, Kategorie, Zustand; Sortierung und Favoriten.</w:t>
+      </w:r>
+      <w:r>
+        <w:t>Abnahme: Kategorien unabhängig vom Lagerort, keine verwaisten Artikel beim Umbenennen; Suche/Filter und Favoriten reproduzierbar.</w:t>
       </w:r>
     </w:p>
     <w:p>
@@ -2080,6 +2082,69 @@
       <w:r/>
       <w:r>
         <w:t>Pro Update werden Prüfungen einzeln dokumentiert. Nicht ausgeführte Tests und noch nicht veröffentlichte GitHub-Stände bleiben offen.</w:t>
+      </w:r>
+    </w:p>
+    <w:p>
+      <w:r/>
+      <w:sdt>
+        <w:sdtPr>
+          <w:alias w:val="Update abgeschlossen"/>
+          <w14:checkbox>
+            <w14:checked w14:val="0"/>
+            <w14:checkedState w14:val="2612" w14:font="MS Gothic"/>
+            <w14:uncheckedState w14:val="2610" w14:font="MS Gothic"/>
+          </w14:checkbox>
+        </w:sdtPr>
+        <w:sdtContent>
+          <w:r>
+            <w:t>☐</w:t>
+          </w:r>
+        </w:sdtContent>
+      </w:sdt>
+      <w:r>
+        <w:t xml:space="preserve">  Programmcode/Syntax und Funktionslogik geprüft</w:t>
+      </w:r>
+    </w:p>
+    <w:p>
+      <w:r/>
+      <w:sdt>
+        <w:sdtPr>
+          <w:alias w:val="Update abgeschlossen"/>
+          <w14:checkbox>
+            <w14:checked w14:val="0"/>
+            <w14:checkedState w14:val="2612" w14:font="MS Gothic"/>
+            <w14:uncheckedState w14:val="2610" w14:font="MS Gothic"/>
+          </w14:checkbox>
+        </w:sdtPr>
+        <w:sdtContent>
+          <w:r>
+            <w:t>☐</w:t>
+          </w:r>
+        </w:sdtContent>
+      </w:sdt>
+      <w:r>
+        <w:t xml:space="preserve">  Regressionsprüfung: 5 Hauptmodule und Navigation funktionieren</w:t>
+      </w:r>
+    </w:p>
+    <w:p>
+      <w:r/>
+      <w:sdt>
+        <w:sdtPr>
+          <w:alias w:val="Update abgeschlossen"/>
+          <w14:checkbox>
+            <w14:checked w14:val="0"/>
+            <w14:checkedState w14:val="2612" w14:font="MS Gothic"/>
+            <w14:uncheckedState w14:val="2610" w14:font="MS Gothic"/>
+          </w14:checkbox>
+        </w:sdtPr>
+        <w:sdtContent>
+          <w:r>
+            <w:t>☐</w:t>
+          </w:r>
+        </w:sdtContent>
+      </w:sdt>
+      <w:r>
+        <w:t xml:space="preserve">  Lokale Speicherung und Datenbestand geprüft</w:t>
       </w:r>
     </w:p>
     <w:p>
@@ -2100,69 +2165,6 @@
         </w:sdtContent>
       </w:sdt>
       <w:r>
-        <w:t xml:space="preserve">  Programmcode/Syntax und Funktionslogik geprüft</w:t>
-      </w:r>
-    </w:p>
-    <w:p>
-      <w:r/>
-      <w:sdt>
-        <w:sdtPr>
-          <w:alias w:val="Update abgeschlossen"/>
-          <w14:checkbox>
-            <w14:checked w14:val="0"/>
-            <w14:checkedState w14:val="2612" w14:font="MS Gothic"/>
-            <w14:uncheckedState w14:val="2610" w14:font="MS Gothic"/>
-          </w14:checkbox>
-        </w:sdtPr>
-        <w:sdtContent>
-          <w:r>
-            <w:t>☐</w:t>
-          </w:r>
-        </w:sdtContent>
-      </w:sdt>
-      <w:r>
-        <w:t xml:space="preserve">  Regressionsprüfung: 5 Hauptmodule und Navigation funktionieren</w:t>
-      </w:r>
-    </w:p>
-    <w:p>
-      <w:r/>
-      <w:sdt>
-        <w:sdtPr>
-          <w:alias w:val="Update abgeschlossen"/>
-          <w14:checkbox>
-            <w14:checked w14:val="0"/>
-            <w14:checkedState w14:val="2612" w14:font="MS Gothic"/>
-            <w14:uncheckedState w14:val="2610" w14:font="MS Gothic"/>
-          </w14:checkbox>
-        </w:sdtPr>
-        <w:sdtContent>
-          <w:r>
-            <w:t>☐</w:t>
-          </w:r>
-        </w:sdtContent>
-      </w:sdt>
-      <w:r>
-        <w:t xml:space="preserve">  Lokale Speicherung und Datenbestand geprüft</w:t>
-      </w:r>
-    </w:p>
-    <w:p>
-      <w:r/>
-      <w:sdt>
-        <w:sdtPr>
-          <w:alias w:val="Update abgeschlossen"/>
-          <w14:checkbox>
-            <w14:checked w14:val="0"/>
-            <w14:checkedState w14:val="2612" w14:font="MS Gothic"/>
-            <w14:uncheckedState w14:val="2610" w14:font="MS Gothic"/>
-          </w14:checkbox>
-        </w:sdtPr>
-        <w:sdtContent>
-          <w:r>
-            <w:t>☐</w:t>
-          </w:r>
-        </w:sdtContent>
-      </w:sdt>
-      <w:r>
         <w:t xml:space="preserve">  PWA-Offline-Cache und Installationspfad geprüft</w:t>
       </w:r>
     </w:p>
@@ -2214,14 +2216,14 @@
         <w:sdtPr>
           <w:alias w:val="Update abgeschlossen"/>
           <w14:checkbox>
-            <w14:checked w14:val="1"/>
+            <w14:checked w14:val="0"/>
             <w14:checkedState w14:val="2612" w14:font="MS Gothic"/>
             <w14:uncheckedState w14:val="2610" w14:font="MS Gothic"/>
           </w14:checkbox>
         </w:sdtPr>
         <w:sdtContent>
           <w:r>
-            <w:t>☑</w:t>
+            <w:t>☐</w:t>
           </w:r>
         </w:sdtContent>
       </w:sdt>
@@ -2837,6 +2839,48 @@
           </w:p>
         </w:tc>
       </w:tr>
+      <w:tr>
+        <w:tc>
+          <w:tcPr>
+            <w:tcW w:type="dxa" w:w="2465"/>
+          </w:tcPr>
+          <w:p>
+            <w:r>
+              <w:t>L12</w:t>
+            </w:r>
+          </w:p>
+        </w:tc>
+        <w:tc>
+          <w:tcPr>
+            <w:tcW w:type="dxa" w:w="2465"/>
+          </w:tcPr>
+          <w:p>
+            <w:r>
+              <w:t>0.12.0</w:t>
+            </w:r>
+          </w:p>
+        </w:tc>
+        <w:tc>
+          <w:tcPr>
+            <w:tcW w:type="dxa" w:w="2465"/>
+          </w:tcPr>
+          <w:p>
+            <w:r>
+              <w:t>27.10.2026</w:t>
+            </w:r>
+          </w:p>
+        </w:tc>
+        <w:tc>
+          <w:tcPr>
+            <w:tcW w:type="dxa" w:w="2465"/>
+          </w:tcPr>
+          <w:p>
+            <w:r>
+              <w:t>GitHub: ef13c460 · Node L05–L12 PASS · Chrome/Android offen</w:t>
+            </w:r>
+          </w:p>
+        </w:tc>
+      </w:tr>
     </w:tbl>
     <w:p>
       <w:pPr>
@@ -3565,6 +3609,490 @@
     <w:p>
       <w:r>
         <w:t>Tests: L04–L10 Node- und JS-Syntaxprüfungen PASS. Canvas-Bildverarbeitung unter Chromium about:blank mit Originalbytes und WebP-Zielauflösung PASS. Die vollständige lokale Browsernavigation ist mit ERR_BLOCKED_BY_ADMINISTRATOR blockiert. Echte Android-Kamera-, Galerie-, IndexedDB-Wiederöffnungs-, Offline- und Update-Prüfung ist ausstehend; diese Punkte dürfen nicht als bestanden gelten.</w:t>
+      </w:r>
+    </w:p>
+    <w:p>
+      <w:pPr>
+        <w:pStyle w:val="Heading2"/>
+      </w:pPr>
+      <w:r>
+        <w:t>L12 · Veröffentlichung V0.12.0 / 3D-Regal und Packungen</w:t>
+      </w:r>
+    </w:p>
+    <w:p>
+      <w:r>
+        <w:t>GitHub main: Code-Commit ef13c460a1f3ef393b307e09410beca5d3c24212. Build L12 / Version 0.12.0; Service-Worker-Cache mein-alltag-v0-12-0. GitHub-Dateiabgleich für version.json, assets/app.js, sw.js, lagerhaus-shelf.js und lagerhaus-tracking.js durchgeführt.</w:t>
+      </w:r>
+    </w:p>
+    <w:p>
+      <w:r>
+        <w:t>Umsetzung: größere 3D-Raumansicht; Zoom +/-/Reset, Zwei-Finger-Pinch und Vollbild; schematische Packungssymbole nur bei Artikelbestand im Möbel/Fach; Fach-Inventar beim Tippen mit optionalem vorhandenen Hauptfoto, Mengen und Status voller/angebrochener Gebinde; Raumartikel ohne Regal sichtbar und freie Menge in ein Möbel/Fach buchbar. Reservierte Einzelgebinde weiter geschützt.</w:t>
+      </w:r>
+    </w:p>
+    <w:p>
+      <w:r>
+        <w:t>Gebinde: Bereits angebrochene Packungen erhalten Kapazität + reale Restmenge; wenn neu erfasst, wird nur der Rest als real vorhandene Menge gebucht. Bei Kennzeichnung existierender Ware wird nichts doppelt gebucht. Datenschema und Store-Namen bleiben unverändert.</w:t>
+      </w:r>
+    </w:p>
+    <w:p>
+      <w:r>
+        <w:t>Qualität: L05–L12-Logik-/Regressionstests PASS; alle Produktiv-JavaScript-Dateien syntaktisch geprüft; neue Offline-Assets vollständig. Browser-End-to-End scheiterte an Netzsperre (net::ERR_BLOCKED_BY_ADMINISTRATOR auf localhost). Android-Gerätetest für Touch-/Pinch-/Vollbild und tatsächliche Bestandsmigration noch offen. ZIP enthält keine lokalen persönlichen Artikel/Fotos.</w:t>
+      </w:r>
+    </w:p>
+    <w:p>
+      <w:pPr>
+        <w:pStyle w:val="Heading2"/>
+      </w:pPr>
+      <w:r>
+        <w:t>L12 · Einzelabnahme zum Abhaken</w:t>
+      </w:r>
+    </w:p>
+    <w:p>
+      <w:pPr>
+        <w:keepNext w:val="0"/>
+        <w:keepLines/>
+        <w:spacing w:before="0" w:after="20" w:line="240" w:lineRule="auto"/>
+      </w:pPr>
+      <w:sdt>
+        <w:sdtPr>
+          <w:alias w:val="Update abgeschlossen"/>
+          <w14:checkbox>
+            <w14:checked w14:val="1"/>
+            <w14:checkedState w14:val="2612" w14:font="MS Gothic"/>
+            <w14:uncheckedState w14:val="2610" w14:font="MS Gothic"/>
+          </w14:checkbox>
+        </w:sdtPr>
+        <w:sdtContent>
+          <w:r>
+            <w:t>☑</w:t>
+          </w:r>
+        </w:sdtContent>
+      </w:sdt>
+      <w:r>
+        <w:rPr>
+          <w:sz w:val="18"/>
+        </w:rPr>
+        <w:t xml:space="preserve">  L12 – 3D-Raum vergrößert und Zoom-Tasten/Reset implementiert</w:t>
+      </w:r>
+    </w:p>
+    <w:p>
+      <w:pPr>
+        <w:keepNext w:val="0"/>
+        <w:keepLines/>
+        <w:spacing w:before="0" w:after="20" w:line="240" w:lineRule="auto"/>
+      </w:pPr>
+      <w:sdt>
+        <w:sdtPr>
+          <w:alias w:val="Update abgeschlossen"/>
+          <w14:checkbox>
+            <w14:checked w14:val="1"/>
+            <w14:checkedState w14:val="2612" w14:font="MS Gothic"/>
+            <w14:uncheckedState w14:val="2610" w14:font="MS Gothic"/>
+          </w14:checkbox>
+        </w:sdtPr>
+        <w:sdtContent>
+          <w:r>
+            <w:t>☑</w:t>
+          </w:r>
+        </w:sdtContent>
+      </w:sdt>
+      <w:r>
+        <w:rPr>
+          <w:sz w:val="18"/>
+        </w:rPr>
+        <w:t xml:space="preserve">  L12 – Pinch-Zoom und Vollbildbedienung programmiert</w:t>
+      </w:r>
+    </w:p>
+    <w:p>
+      <w:pPr>
+        <w:keepNext w:val="0"/>
+        <w:keepLines/>
+        <w:spacing w:before="0" w:after="20" w:line="240" w:lineRule="auto"/>
+      </w:pPr>
+      <w:sdt>
+        <w:sdtPr>
+          <w:alias w:val="Update abgeschlossen"/>
+          <w14:checkbox>
+            <w14:checked w14:val="1"/>
+            <w14:checkedState w14:val="2612" w14:font="MS Gothic"/>
+            <w14:uncheckedState w14:val="2610" w14:font="MS Gothic"/>
+          </w14:checkbox>
+        </w:sdtPr>
+        <w:sdtContent>
+          <w:r>
+            <w:t>☑</w:t>
+          </w:r>
+        </w:sdtContent>
+      </w:sdt>
+      <w:r>
+        <w:rPr>
+          <w:sz w:val="18"/>
+        </w:rPr>
+        <w:t xml:space="preserve">  L12 – Artikelpakete aus echtem Standortbestand schematisch im Regal gezeichnet</w:t>
+      </w:r>
+    </w:p>
+    <w:p>
+      <w:pPr>
+        <w:keepNext w:val="0"/>
+        <w:keepLines/>
+        <w:spacing w:before="0" w:after="20" w:line="240" w:lineRule="auto"/>
+      </w:pPr>
+      <w:sdt>
+        <w:sdtPr>
+          <w:alias w:val="Update abgeschlossen"/>
+          <w14:checkbox>
+            <w14:checked w14:val="1"/>
+            <w14:checkedState w14:val="2612" w14:font="MS Gothic"/>
+            <w14:uncheckedState w14:val="2610" w14:font="MS Gothic"/>
+          </w14:checkbox>
+        </w:sdtPr>
+        <w:sdtContent>
+          <w:r>
+            <w:t>☑</w:t>
+          </w:r>
+        </w:sdtContent>
+      </w:sdt>
+      <w:r>
+        <w:rPr>
+          <w:sz w:val="18"/>
+        </w:rPr>
+        <w:t xml:space="preserve">  L12 – Regal öffnen zeigt echte Artikelpositionen pro Fach</w:t>
+      </w:r>
+    </w:p>
+    <w:p>
+      <w:pPr>
+        <w:keepNext w:val="0"/>
+        <w:keepLines/>
+        <w:spacing w:before="0" w:after="20" w:line="240" w:lineRule="auto"/>
+      </w:pPr>
+      <w:sdt>
+        <w:sdtPr>
+          <w:alias w:val="Update abgeschlossen"/>
+          <w14:checkbox>
+            <w14:checked w14:val="1"/>
+            <w14:checkedState w14:val="2612" w14:font="MS Gothic"/>
+            <w14:uncheckedState w14:val="2610" w14:font="MS Gothic"/>
+          </w14:checkbox>
+        </w:sdtPr>
+        <w:sdtContent>
+          <w:r>
+            <w:t>☑</w:t>
+          </w:r>
+        </w:sdtContent>
+      </w:sdt>
+      <w:r>
+        <w:rPr>
+          <w:sz w:val="18"/>
+        </w:rPr>
+        <w:t xml:space="preserve">  L12 – Optional vorhandenes Hauptfoto in Regal-Inventar verknüpft</w:t>
+      </w:r>
+    </w:p>
+    <w:p>
+      <w:pPr>
+        <w:keepNext w:val="0"/>
+        <w:keepLines/>
+        <w:spacing w:before="0" w:after="20" w:line="240" w:lineRule="auto"/>
+      </w:pPr>
+      <w:sdt>
+        <w:sdtPr>
+          <w:alias w:val="Update abgeschlossen"/>
+          <w14:checkbox>
+            <w14:checked w14:val="1"/>
+            <w14:checkedState w14:val="2612" w14:font="MS Gothic"/>
+            <w14:uncheckedState w14:val="2610" w14:font="MS Gothic"/>
+          </w14:checkbox>
+        </w:sdtPr>
+        <w:sdtContent>
+          <w:r>
+            <w:t>☑</w:t>
+          </w:r>
+        </w:sdtContent>
+      </w:sdt>
+      <w:r>
+        <w:rPr>
+          <w:sz w:val="18"/>
+        </w:rPr>
+        <w:t xml:space="preserve">  L12 – Voll/angebrochen und Restmenge pro Gebinde im Regal-Inventar angezeigt</w:t>
+      </w:r>
+    </w:p>
+    <w:p>
+      <w:pPr>
+        <w:keepNext w:val="0"/>
+        <w:keepLines/>
+        <w:spacing w:before="0" w:after="20" w:line="240" w:lineRule="auto"/>
+      </w:pPr>
+      <w:sdt>
+        <w:sdtPr>
+          <w:alias w:val="Update abgeschlossen"/>
+          <w14:checkbox>
+            <w14:checked w14:val="1"/>
+            <w14:checkedState w14:val="2612" w14:font="MS Gothic"/>
+            <w14:uncheckedState w14:val="2610" w14:font="MS Gothic"/>
+          </w14:checkbox>
+        </w:sdtPr>
+        <w:sdtContent>
+          <w:r>
+            <w:t>☑</w:t>
+          </w:r>
+        </w:sdtContent>
+      </w:sdt>
+      <w:r>
+        <w:rPr>
+          <w:sz w:val="18"/>
+        </w:rPr>
+        <w:t xml:space="preserve">  L12 – Noch nicht eingeräumte Raumartikel sichtbar</w:t>
+      </w:r>
+    </w:p>
+    <w:p>
+      <w:pPr>
+        <w:keepNext w:val="0"/>
+        <w:keepLines/>
+        <w:spacing w:before="0" w:after="20" w:line="240" w:lineRule="auto"/>
+      </w:pPr>
+      <w:sdt>
+        <w:sdtPr>
+          <w:alias w:val="Update abgeschlossen"/>
+          <w14:checkbox>
+            <w14:checked w14:val="1"/>
+            <w14:checkedState w14:val="2612" w14:font="MS Gothic"/>
+            <w14:uncheckedState w14:val="2610" w14:font="MS Gothic"/>
+          </w14:checkbox>
+        </w:sdtPr>
+        <w:sdtContent>
+          <w:r>
+            <w:t>☑</w:t>
+          </w:r>
+        </w:sdtContent>
+      </w:sdt>
+      <w:r>
+        <w:rPr>
+          <w:sz w:val="18"/>
+        </w:rPr>
+        <w:t xml:space="preserve">  L12 – Freie Mengen atomar einem Regal/Fach zuordnen; reservierte Gebinde geschützt</w:t>
+      </w:r>
+    </w:p>
+    <w:p>
+      <w:pPr>
+        <w:keepNext w:val="0"/>
+        <w:keepLines/>
+        <w:spacing w:before="0" w:after="20" w:line="240" w:lineRule="auto"/>
+      </w:pPr>
+      <w:sdt>
+        <w:sdtPr>
+          <w:alias w:val="Update abgeschlossen"/>
+          <w14:checkbox>
+            <w14:checked w14:val="1"/>
+            <w14:checkedState w14:val="2612" w14:font="MS Gothic"/>
+            <w14:uncheckedState w14:val="2610" w14:font="MS Gothic"/>
+          </w14:checkbox>
+        </w:sdtPr>
+        <w:sdtContent>
+          <w:r>
+            <w:t>☑</w:t>
+          </w:r>
+        </w:sdtContent>
+      </w:sdt>
+      <w:r>
+        <w:rPr>
+          <w:sz w:val="18"/>
+        </w:rPr>
+        <w:t xml:space="preserve">  L12 – Bereits angebrochene Packungen mit wirklicher Anfangsrestmenge erfassbar</w:t>
+      </w:r>
+    </w:p>
+    <w:p>
+      <w:pPr>
+        <w:keepNext w:val="0"/>
+        <w:keepLines/>
+        <w:spacing w:before="0" w:after="20" w:line="240" w:lineRule="auto"/>
+      </w:pPr>
+      <w:sdt>
+        <w:sdtPr>
+          <w:alias w:val="Update abgeschlossen"/>
+          <w14:checkbox>
+            <w14:checked w14:val="1"/>
+            <w14:checkedState w14:val="2612" w14:font="MS Gothic"/>
+            <w14:uncheckedState w14:val="2610" w14:font="MS Gothic"/>
+          </w14:checkbox>
+        </w:sdtPr>
+        <w:sdtContent>
+          <w:r>
+            <w:t>☑</w:t>
+          </w:r>
+        </w:sdtContent>
+      </w:sdt>
+      <w:r>
+        <w:rPr>
+          <w:sz w:val="18"/>
+        </w:rPr>
+        <w:t xml:space="preserve">  L12 – L05–L12-Regressions- und Produktiv-Syntaxprüfungen bestanden</w:t>
+      </w:r>
+    </w:p>
+    <w:p>
+      <w:pPr>
+        <w:keepNext w:val="0"/>
+        <w:keepLines/>
+        <w:spacing w:before="0" w:after="20" w:line="240" w:lineRule="auto"/>
+      </w:pPr>
+      <w:sdt>
+        <w:sdtPr>
+          <w:alias w:val="Update abgeschlossen"/>
+          <w14:checkbox>
+            <w14:checked w14:val="1"/>
+            <w14:checkedState w14:val="2612" w14:font="MS Gothic"/>
+            <w14:uncheckedState w14:val="2610" w14:font="MS Gothic"/>
+          </w14:checkbox>
+        </w:sdtPr>
+        <w:sdtContent>
+          <w:r>
+            <w:t>☑</w:t>
+          </w:r>
+        </w:sdtContent>
+      </w:sdt>
+      <w:r>
+        <w:rPr>
+          <w:sz w:val="18"/>
+        </w:rPr>
+        <w:t xml:space="preserve">  L12 – Versionsdatei, Service-Worker-Cache und Offline-Precache geprüft</w:t>
+      </w:r>
+    </w:p>
+    <w:p>
+      <w:pPr>
+        <w:keepNext w:val="0"/>
+        <w:keepLines/>
+        <w:spacing w:before="0" w:after="20" w:line="240" w:lineRule="auto"/>
+      </w:pPr>
+      <w:sdt>
+        <w:sdtPr>
+          <w:alias w:val="Update abgeschlossen"/>
+          <w14:checkbox>
+            <w14:checked w14:val="1"/>
+            <w14:checkedState w14:val="2612" w14:font="MS Gothic"/>
+            <w14:uncheckedState w14:val="2610" w14:font="MS Gothic"/>
+          </w14:checkbox>
+        </w:sdtPr>
+        <w:sdtContent>
+          <w:r>
+            <w:t>☑</w:t>
+          </w:r>
+        </w:sdtContent>
+      </w:sdt>
+      <w:r>
+        <w:rPr>
+          <w:sz w:val="18"/>
+        </w:rPr>
+        <w:t xml:space="preserve">  L12 – GitHub main veröffentlicht, fünf Dateien erneut abgeglichen</w:t>
+      </w:r>
+    </w:p>
+    <w:p>
+      <w:pPr>
+        <w:keepNext w:val="0"/>
+        <w:keepLines/>
+        <w:spacing w:before="0" w:after="20" w:line="240" w:lineRule="auto"/>
+      </w:pPr>
+      <w:sdt>
+        <w:sdtPr>
+          <w:alias w:val="Update abgeschlossen"/>
+          <w14:checkbox>
+            <w14:checked w14:val="1"/>
+            <w14:checkedState w14:val="2612" w14:font="MS Gothic"/>
+            <w14:uncheckedState w14:val="2610" w14:font="MS Gothic"/>
+          </w14:checkbox>
+        </w:sdtPr>
+        <w:sdtContent>
+          <w:r>
+            <w:t>☑</w:t>
+          </w:r>
+        </w:sdtContent>
+      </w:sdt>
+      <w:r>
+        <w:rPr>
+          <w:sz w:val="18"/>
+        </w:rPr>
+        <w:t xml:space="preserve">  L12 – ZIP mit aktualisierter bauhaus.docx erzeugt und Integrität geprüft</w:t>
+      </w:r>
+    </w:p>
+    <w:p>
+      <w:pPr>
+        <w:keepNext w:val="0"/>
+        <w:keepLines/>
+        <w:spacing w:before="0" w:after="20" w:line="240" w:lineRule="auto"/>
+      </w:pPr>
+      <w:sdt>
+        <w:sdtPr>
+          <w:alias w:val="Update abgeschlossen"/>
+          <w14:checkbox>
+            <w14:checked w14:val="0"/>
+            <w14:checkedState w14:val="2612" w14:font="MS Gothic"/>
+            <w14:uncheckedState w14:val="2610" w14:font="MS Gothic"/>
+          </w14:checkbox>
+        </w:sdtPr>
+        <w:sdtContent>
+          <w:r>
+            <w:t>☐</w:t>
+          </w:r>
+        </w:sdtContent>
+      </w:sdt>
+      <w:r>
+        <w:rPr>
+          <w:sz w:val="18"/>
+        </w:rPr>
+        <w:t xml:space="preserve">  L12 – Echter Android-Test: Regal antippen, Zwei-Finger-Zoom, Vollbild</w:t>
+      </w:r>
+    </w:p>
+    <w:p>
+      <w:pPr>
+        <w:keepNext w:val="0"/>
+        <w:keepLines/>
+        <w:spacing w:before="0" w:after="20" w:line="240" w:lineRule="auto"/>
+      </w:pPr>
+      <w:sdt>
+        <w:sdtPr>
+          <w:alias w:val="Update abgeschlossen"/>
+          <w14:checkbox>
+            <w14:checked w14:val="0"/>
+            <w14:checkedState w14:val="2612" w14:font="MS Gothic"/>
+            <w14:uncheckedState w14:val="2610" w14:font="MS Gothic"/>
+          </w14:checkbox>
+        </w:sdtPr>
+        <w:sdtContent>
+          <w:r>
+            <w:t>☐</w:t>
+          </w:r>
+        </w:sdtContent>
+      </w:sdt>
+      <w:r>
+        <w:rPr>
+          <w:sz w:val="18"/>
+        </w:rPr>
+        <w:t xml:space="preserve">  L12 – Browser-End-to-End-Test mit persistenter IndexedDB und Offlinebetrieb</w:t>
+      </w:r>
+    </w:p>
+    <w:p>
+      <w:pPr>
+        <w:keepNext w:val="0"/>
+        <w:keepLines/>
+        <w:spacing w:before="0" w:after="20" w:line="240" w:lineRule="auto"/>
+      </w:pPr>
+      <w:sdt>
+        <w:sdtPr>
+          <w:alias w:val="Update abgeschlossen"/>
+          <w14:checkbox>
+            <w14:checked w14:val="0"/>
+            <w14:checkedState w14:val="2612" w14:font="MS Gothic"/>
+            <w14:uncheckedState w14:val="2610" w14:font="MS Gothic"/>
+          </w14:checkbox>
+        </w:sdtPr>
+        <w:sdtContent>
+          <w:r>
+            <w:t>☐</w:t>
+          </w:r>
+        </w:sdtContent>
+      </w:sdt>
+      <w:r>
+        <w:rPr>
+          <w:sz w:val="18"/>
+        </w:rPr>
+        <w:t xml:space="preserve">  L12 – Installation/Cache-Update auf dem echten Android-Handy kontrolliert</w:t>
       </w:r>
     </w:p>
     <w:sectPr>

</xml_diff>